<commit_message>
Updates to front matter
</commit_message>
<xml_diff>
--- a/Front Matter/Template/1_Front-Matter_Template-v4.docx
+++ b/Front Matter/Template/1_Front-Matter_Template-v4.docx
@@ -1107,6 +1107,7 @@
         <w:rPr>
           <w:rFonts w:ascii="Noto Serif" w:eastAsia="Noto Serif SC" w:hAnsi="Noto Serif" w:cs="Noto Serif"/>
           <w:b/>
+          <w:bCs/>
           <w:color w:val="000000" w:themeColor="text1"/>
           <w:szCs w:val="32"/>
           <w:lang w:val="en-GB"/>
@@ -1114,8 +1115,9 @@
       </w:pPr>
       <w:r>
         <w:rPr>
-          <w:rFonts w:ascii="Noto Serif" w:eastAsia="Noto Serif SC" w:hAnsi="Noto Serif" w:cs="Noto Serif" w:hint="eastAsia"/>
+          <w:rFonts w:ascii="Noto Serif" w:eastAsia="Noto Serif SC" w:hAnsi="Noto Serif" w:cs="Noto Serif"/>
           <w:b/>
+          <w:bCs/>
           <w:color w:val="000000" w:themeColor="text1"/>
           <w:szCs w:val="32"/>
         </w:rPr>
@@ -1128,6 +1130,7 @@
         <w:rPr>
           <w:rFonts w:ascii="Noto Serif" w:eastAsia="Noto Serif SC" w:hAnsi="Noto Serif" w:cs="Noto Serif"/>
           <w:b/>
+          <w:bCs/>
           <w:color w:val="000000" w:themeColor="text1"/>
           <w:sz w:val="20"/>
           <w:szCs w:val="24"/>
@@ -1137,6 +1140,7 @@
         <w:rPr>
           <w:rFonts w:ascii="Noto Serif" w:eastAsia="Noto Serif SC" w:hAnsi="Noto Serif" w:cs="Noto Serif"/>
           <w:b/>
+          <w:bCs/>
           <w:color w:val="000000" w:themeColor="text1"/>
           <w:sz w:val="20"/>
           <w:szCs w:val="24"/>
@@ -1171,7 +1175,54 @@
           <w:sz w:val="20"/>
           <w:szCs w:val="24"/>
         </w:rPr>
-        <w:t>Copyright © Singapore Chinese Orchestra Ltd. All rights reserved.</w:t>
+        <w:t>ISMN</w:t>
+      </w:r>
+    </w:p>
+    <w:p>
+      <w:pPr>
+        <w:rPr>
+          <w:rFonts w:ascii="Noto Serif" w:eastAsia="Noto Serif SC" w:hAnsi="Noto Serif" w:cs="Noto Serif"/>
+          <w:color w:val="000000" w:themeColor="text1"/>
+          <w:sz w:val="20"/>
+          <w:szCs w:val="24"/>
+        </w:rPr>
+      </w:pPr>
+    </w:p>
+    <w:p>
+      <w:pPr>
+        <w:rPr>
+          <w:rFonts w:ascii="Noto Serif" w:eastAsia="Noto Serif SC" w:hAnsi="Noto Serif" w:cs="Noto Serif"/>
+          <w:color w:val="000000" w:themeColor="text1"/>
+          <w:sz w:val="20"/>
+          <w:szCs w:val="24"/>
+        </w:rPr>
+      </w:pPr>
+      <w:r>
+        <w:rPr>
+          <w:rFonts w:ascii="Noto Serif" w:eastAsia="Noto Serif SC" w:hAnsi="Noto Serif" w:cs="Noto Serif"/>
+          <w:color w:val="000000" w:themeColor="text1"/>
+          <w:sz w:val="20"/>
+          <w:szCs w:val="24"/>
+        </w:rPr>
+        <w:t xml:space="preserve">Copyright © Singapore Chinese Orchestra </w:t>
+      </w:r>
+      <w:r>
+        <w:rPr>
+          <w:rFonts w:ascii="Noto Serif" w:eastAsia="Noto Serif SC" w:hAnsi="Noto Serif" w:cs="Noto Serif"/>
+          <w:color w:val="000000" w:themeColor="text1"/>
+          <w:sz w:val="20"/>
+          <w:szCs w:val="24"/>
+        </w:rPr>
+        <w:t xml:space="preserve">Co. </w:t>
+      </w:r>
+      <w:r>
+        <w:rPr>
+          <w:rFonts w:ascii="Noto Serif" w:eastAsia="Noto Serif SC" w:hAnsi="Noto Serif" w:cs="Noto Serif"/>
+          <w:color w:val="000000" w:themeColor="text1"/>
+          <w:sz w:val="20"/>
+          <w:szCs w:val="24"/>
+        </w:rPr>
+        <w:t>Ltd. All rights reserved.</w:t>
       </w:r>
       <w:r>
         <w:rPr>
@@ -1204,7 +1255,7 @@
       </w:pPr>
       <w:r>
         <w:rPr>
-          <w:rFonts w:ascii="Noto Serif" w:eastAsia="Noto Serif SC" w:hAnsi="Noto Serif" w:cs="Noto Serif" w:hint="eastAsia"/>
+          <w:rFonts w:ascii="Noto Serif" w:eastAsia="Noto Serif SC" w:hAnsi="Noto Serif" w:cs="Noto Serif"/>
           <w:color w:val="000000" w:themeColor="text1"/>
           <w:szCs w:val="32"/>
         </w:rPr>
@@ -1220,7 +1271,7 @@
       </w:r>
       <w:r>
         <w:rPr>
-          <w:rFonts w:ascii="Noto Serif" w:eastAsia="Noto Serif SC" w:hAnsi="Noto Serif" w:cs="Noto Serif" w:hint="eastAsia"/>
+          <w:rFonts w:ascii="Noto Serif" w:eastAsia="Noto Serif SC" w:hAnsi="Noto Serif" w:cs="Noto Serif"/>
           <w:color w:val="000000" w:themeColor="text1"/>
           <w:szCs w:val="32"/>
         </w:rPr>
@@ -1236,7 +1287,7 @@
       </w:r>
       <w:r>
         <w:rPr>
-          <w:rFonts w:ascii="Noto Serif" w:eastAsia="Noto Serif SC" w:hAnsi="Noto Serif" w:cs="Noto Serif" w:hint="eastAsia"/>
+          <w:rFonts w:ascii="Noto Serif" w:eastAsia="Noto Serif SC" w:hAnsi="Noto Serif" w:cs="Noto Serif"/>
           <w:color w:val="000000" w:themeColor="text1"/>
           <w:szCs w:val="32"/>
         </w:rPr>
@@ -1303,19 +1354,39 @@
     <w:p>
       <w:pPr>
         <w:rPr>
-          <w:rFonts w:ascii="Noto Serif" w:eastAsia="Noto Serif SC" w:hAnsi="Noto Serif" w:cs="Noto Serif"/>
+          <w:rFonts w:ascii="Noto Serif SC" w:eastAsia="Noto Serif SC" w:hAnsi="Noto Serif SC" w:cs="Noto Serif"/>
           <w:color w:val="000000" w:themeColor="text1"/>
           <w:sz w:val="20"/>
           <w:szCs w:val="24"/>
-        </w:rPr>
-      </w:pPr>
-      <w:r>
-        <w:rPr>
-          <w:rFonts w:ascii="Noto Serif" w:eastAsia="Noto Serif SC" w:hAnsi="Noto Serif" w:cs="Noto Serif"/>
+          <w:lang w:val="en-US"/>
+        </w:rPr>
+      </w:pPr>
+      <w:r>
+        <w:rPr>
+          <w:rFonts w:ascii="Noto Serif SC" w:eastAsia="Noto Serif SC" w:hAnsi="Noto Serif SC" w:cs="Noto Serif"/>
           <w:color w:val="000000" w:themeColor="text1"/>
           <w:sz w:val="20"/>
           <w:szCs w:val="24"/>
         </w:rPr>
+        <w:t>印刷于新加坡。</w:t>
+      </w:r>
+    </w:p>
+    <w:p>
+      <w:pPr>
+        <w:rPr>
+          <w:rFonts w:ascii="Noto Serif SC" w:eastAsia="Noto Serif SC" w:hAnsi="Noto Serif SC" w:cs="Noto Serif"/>
+          <w:color w:val="000000" w:themeColor="text1"/>
+          <w:sz w:val="20"/>
+          <w:szCs w:val="24"/>
+        </w:rPr>
+      </w:pPr>
+      <w:r>
+        <w:rPr>
+          <w:rFonts w:ascii="Noto Serif SC" w:eastAsia="Noto Serif SC" w:hAnsi="Noto Serif SC" w:cs="Noto Serif"/>
+          <w:color w:val="000000" w:themeColor="text1"/>
+          <w:sz w:val="20"/>
+          <w:szCs w:val="24"/>
+        </w:rPr>
         <w:t>Printed in Singapore.</w:t>
       </w:r>
     </w:p>
@@ -1336,6 +1407,7 @@
           <w:color w:val="000000" w:themeColor="text1"/>
           <w:sz w:val="20"/>
           <w:szCs w:val="24"/>
+          <w:lang w:val="en-US"/>
         </w:rPr>
       </w:pPr>
       <w:r>
@@ -1344,8 +1416,9 @@
           <w:color w:val="000000" w:themeColor="text1"/>
           <w:sz w:val="20"/>
           <w:szCs w:val="24"/>
-        </w:rPr>
-        <w:t>Singapore Chinese Orchestra Ltd.</w:t>
+          <w:lang w:val="en-US"/>
+        </w:rPr>
+        <w:t>新加坡华乐团有限公司</w:t>
       </w:r>
     </w:p>
     <w:p>
@@ -1355,6 +1428,7 @@
           <w:color w:val="000000" w:themeColor="text1"/>
           <w:sz w:val="20"/>
           <w:szCs w:val="24"/>
+          <w:lang w:val="en-US"/>
         </w:rPr>
       </w:pPr>
       <w:r>
@@ -1363,8 +1437,9 @@
           <w:color w:val="000000" w:themeColor="text1"/>
           <w:sz w:val="20"/>
           <w:szCs w:val="24"/>
-        </w:rPr>
-        <w:t>Singapore Conference Hall,</w:t>
+          <w:lang w:val="en-US"/>
+        </w:rPr>
+        <w:t>珊顿道</w:t>
       </w:r>
       <w:r>
         <w:rPr>
@@ -1372,36 +1447,40 @@
           <w:color w:val="000000" w:themeColor="text1"/>
           <w:sz w:val="20"/>
           <w:szCs w:val="24"/>
-        </w:rPr>
-        <w:t xml:space="preserve"> </w:t>
-      </w:r>
-    </w:p>
-    <w:p>
-      <w:pPr>
+          <w:lang w:val="en-US"/>
+        </w:rPr>
+        <w:t>7</w:t>
+      </w:r>
+      <w:r>
         <w:rPr>
           <w:rFonts w:ascii="Noto Serif" w:eastAsia="Noto Serif SC" w:hAnsi="Noto Serif" w:cs="Noto Serif"/>
           <w:color w:val="000000" w:themeColor="text1"/>
           <w:sz w:val="20"/>
           <w:szCs w:val="24"/>
-        </w:rPr>
-      </w:pPr>
-      <w:r>
+          <w:lang w:val="en-US"/>
+        </w:rPr>
+        <w:t>号</w:t>
+      </w:r>
+    </w:p>
+    <w:p>
+      <w:pPr>
         <w:rPr>
           <w:rFonts w:ascii="Noto Serif" w:eastAsia="Noto Serif SC" w:hAnsi="Noto Serif" w:cs="Noto Serif"/>
           <w:color w:val="000000" w:themeColor="text1"/>
           <w:sz w:val="20"/>
           <w:szCs w:val="24"/>
-        </w:rPr>
-        <w:t>7 Shenton Way,</w:t>
-      </w:r>
+          <w:lang w:val="en-US"/>
+        </w:rPr>
+      </w:pPr>
       <w:r>
         <w:rPr>
           <w:rFonts w:ascii="Noto Serif" w:eastAsia="Noto Serif SC" w:hAnsi="Noto Serif" w:cs="Noto Serif"/>
           <w:color w:val="000000" w:themeColor="text1"/>
           <w:sz w:val="20"/>
           <w:szCs w:val="24"/>
-        </w:rPr>
-        <w:t xml:space="preserve"> </w:t>
+          <w:lang w:val="en-US"/>
+        </w:rPr>
+        <w:t>新加坡大会堂</w:t>
       </w:r>
     </w:p>
     <w:p>
@@ -1411,6 +1490,7 @@
           <w:color w:val="000000" w:themeColor="text1"/>
           <w:sz w:val="20"/>
           <w:szCs w:val="24"/>
+          <w:lang w:val="en-US"/>
         </w:rPr>
       </w:pPr>
       <w:r>
@@ -1419,6 +1499,111 @@
           <w:color w:val="000000" w:themeColor="text1"/>
           <w:sz w:val="20"/>
           <w:szCs w:val="24"/>
+          <w:lang w:val="en-US"/>
+        </w:rPr>
+        <w:t>新加坡邮区</w:t>
+      </w:r>
+      <w:r>
+        <w:rPr>
+          <w:rFonts w:ascii="Noto Serif" w:eastAsia="Noto Serif SC" w:hAnsi="Noto Serif" w:cs="Noto Serif"/>
+          <w:color w:val="000000" w:themeColor="text1"/>
+          <w:sz w:val="20"/>
+          <w:szCs w:val="24"/>
+          <w:lang w:val="en-US"/>
+        </w:rPr>
+        <w:t> 068810</w:t>
+      </w:r>
+    </w:p>
+    <w:p>
+      <w:pPr>
+        <w:rPr>
+          <w:rFonts w:ascii="Noto Serif" w:eastAsia="Noto Serif SC" w:hAnsi="Noto Serif" w:cs="Noto Serif"/>
+          <w:color w:val="000000" w:themeColor="text1"/>
+          <w:sz w:val="20"/>
+          <w:szCs w:val="24"/>
+        </w:rPr>
+      </w:pPr>
+    </w:p>
+    <w:p>
+      <w:pPr>
+        <w:rPr>
+          <w:rFonts w:ascii="Noto Serif" w:eastAsia="Noto Serif SC" w:hAnsi="Noto Serif" w:cs="Noto Serif"/>
+          <w:color w:val="000000" w:themeColor="text1"/>
+          <w:sz w:val="20"/>
+          <w:szCs w:val="24"/>
+          <w:lang w:val="en-US"/>
+        </w:rPr>
+      </w:pPr>
+      <w:r>
+        <w:rPr>
+          <w:rFonts w:ascii="Noto Serif" w:eastAsia="Noto Serif SC" w:hAnsi="Noto Serif" w:cs="Noto Serif"/>
+          <w:color w:val="000000" w:themeColor="text1"/>
+          <w:sz w:val="20"/>
+          <w:szCs w:val="24"/>
+          <w:lang w:val="en-US"/>
+        </w:rPr>
+        <w:t>Singapore Chinese Orchestra Co. Ltd.</w:t>
+      </w:r>
+    </w:p>
+    <w:p>
+      <w:pPr>
+        <w:rPr>
+          <w:rFonts w:ascii="Noto Serif" w:eastAsia="Noto Serif SC" w:hAnsi="Noto Serif" w:cs="Noto Serif"/>
+          <w:color w:val="000000" w:themeColor="text1"/>
+          <w:sz w:val="20"/>
+          <w:szCs w:val="24"/>
+          <w:lang w:val="en-US"/>
+        </w:rPr>
+      </w:pPr>
+      <w:r>
+        <w:rPr>
+          <w:rFonts w:ascii="Noto Serif" w:eastAsia="Noto Serif SC" w:hAnsi="Noto Serif" w:cs="Noto Serif"/>
+          <w:color w:val="000000" w:themeColor="text1"/>
+          <w:sz w:val="20"/>
+          <w:szCs w:val="24"/>
+          <w:lang w:val="en-US"/>
+        </w:rPr>
+        <w:t>7 Shenton Way</w:t>
+      </w:r>
+    </w:p>
+    <w:p>
+      <w:pPr>
+        <w:rPr>
+          <w:rFonts w:ascii="Noto Serif" w:eastAsia="Noto Serif SC" w:hAnsi="Noto Serif" w:cs="Noto Serif"/>
+          <w:color w:val="000000" w:themeColor="text1"/>
+          <w:sz w:val="20"/>
+          <w:szCs w:val="24"/>
+          <w:lang w:val="en-US"/>
+        </w:rPr>
+      </w:pPr>
+      <w:r>
+        <w:rPr>
+          <w:rFonts w:ascii="Noto Serif" w:eastAsia="Noto Serif SC" w:hAnsi="Noto Serif" w:cs="Noto Serif"/>
+          <w:color w:val="000000" w:themeColor="text1"/>
+          <w:sz w:val="20"/>
+          <w:szCs w:val="24"/>
+          <w:lang w:val="en-US"/>
+        </w:rPr>
+        <w:t>Singapore Conference Hall</w:t>
+      </w:r>
+    </w:p>
+    <w:p>
+      <w:pPr>
+        <w:rPr>
+          <w:rFonts w:ascii="Noto Serif" w:eastAsia="Noto Serif SC" w:hAnsi="Noto Serif" w:cs="Noto Serif"/>
+          <w:color w:val="000000" w:themeColor="text1"/>
+          <w:sz w:val="20"/>
+          <w:szCs w:val="24"/>
+          <w:lang w:val="en-US"/>
+        </w:rPr>
+      </w:pPr>
+      <w:r>
+        <w:rPr>
+          <w:rFonts w:ascii="Noto Serif" w:eastAsia="Noto Serif SC" w:hAnsi="Noto Serif" w:cs="Noto Serif"/>
+          <w:color w:val="000000" w:themeColor="text1"/>
+          <w:sz w:val="20"/>
+          <w:szCs w:val="24"/>
+          <w:lang w:val="en-US"/>
         </w:rPr>
         <w:t>Singapore 068810</w:t>
       </w:r>
@@ -1428,41 +1613,127 @@
         <w:rPr>
           <w:rFonts w:ascii="Noto Serif" w:eastAsia="Noto Serif SC" w:hAnsi="Noto Serif" w:cs="Noto Serif"/>
           <w:b/>
-          <w:sz w:val="36"/>
-          <w:szCs w:val="36"/>
-          <w:lang w:val="en-US"/>
-        </w:rPr>
-      </w:pPr>
-    </w:p>
-    <w:p>
-      <w:pPr>
-        <w:rPr>
-          <w:rFonts w:ascii="Noto Serif" w:eastAsia="Noto Serif SC" w:hAnsi="Noto Serif" w:cs="Noto Serif"/>
-          <w:b/>
-          <w:sz w:val="36"/>
-          <w:szCs w:val="36"/>
-          <w:lang w:val="en-US"/>
-        </w:rPr>
-      </w:pPr>
-    </w:p>
-    <w:p>
-      <w:pPr>
-        <w:rPr>
-          <w:rFonts w:ascii="Noto Serif" w:eastAsia="Noto Serif SC" w:hAnsi="Noto Serif" w:cs="Noto Serif"/>
-          <w:b/>
-          <w:sz w:val="36"/>
-          <w:szCs w:val="36"/>
-          <w:lang w:val="en-US"/>
-        </w:rPr>
-      </w:pPr>
-    </w:p>
-    <w:p>
-      <w:pPr>
-        <w:rPr>
-          <w:rFonts w:ascii="Noto Serif" w:eastAsia="Noto Serif SC" w:hAnsi="Noto Serif" w:cs="Noto Serif"/>
-          <w:b/>
-          <w:sz w:val="36"/>
-          <w:szCs w:val="36"/>
+          <w:sz w:val="20"/>
+          <w:szCs w:val="20"/>
+          <w:lang w:val="en-US"/>
+        </w:rPr>
+      </w:pPr>
+    </w:p>
+    <w:p>
+      <w:pPr>
+        <w:rPr>
+          <w:rFonts w:ascii="Noto Serif" w:eastAsia="Noto Serif SC" w:hAnsi="Noto Serif" w:cs="Noto Serif"/>
+          <w:sz w:val="20"/>
+          <w:szCs w:val="20"/>
+          <w:lang w:val="en-US"/>
+        </w:rPr>
+      </w:pPr>
+      <w:r>
+        <w:rPr>
+          <w:rFonts w:ascii="Noto Serif" w:eastAsia="Noto Serif SC" w:hAnsi="Noto Serif" w:cs="Noto Serif"/>
+          <w:sz w:val="20"/>
+          <w:szCs w:val="20"/>
+          <w:lang w:val="en-US"/>
+        </w:rPr>
+        <w:t>网站</w:t>
+      </w:r>
+      <w:r>
+        <w:rPr>
+          <w:rFonts w:ascii="Noto Serif" w:eastAsia="Noto Serif SC" w:hAnsi="Noto Serif" w:cs="Noto Serif"/>
+          <w:sz w:val="20"/>
+          <w:szCs w:val="20"/>
+          <w:lang w:val="en-US"/>
+        </w:rPr>
+        <w:t>Website: </w:t>
+      </w:r>
+      <w:hyperlink r:id="rId10" w:tgtFrame="_blank" w:history="1">
+        <w:r>
+          <w:rPr>
+            <w:rStyle w:val="Hyperlink"/>
+            <w:rFonts w:ascii="Noto Serif" w:eastAsia="Noto Serif SC" w:hAnsi="Noto Serif" w:cs="Noto Serif"/>
+            <w:sz w:val="20"/>
+            <w:szCs w:val="20"/>
+            <w:lang w:val="en-US"/>
+          </w:rPr>
+          <w:t>www.sco.com.sg</w:t>
+        </w:r>
+      </w:hyperlink>
+    </w:p>
+    <w:p>
+      <w:pPr>
+        <w:rPr>
+          <w:rFonts w:ascii="Noto Serif" w:eastAsia="Noto Serif SC" w:hAnsi="Noto Serif" w:cs="Noto Serif"/>
+          <w:sz w:val="20"/>
+          <w:szCs w:val="20"/>
+          <w:lang w:val="en-US"/>
+        </w:rPr>
+      </w:pPr>
+      <w:r>
+        <w:rPr>
+          <w:rFonts w:ascii="Noto Serif" w:eastAsia="Noto Serif SC" w:hAnsi="Noto Serif" w:cs="Noto Serif"/>
+          <w:sz w:val="20"/>
+          <w:szCs w:val="20"/>
+          <w:lang w:val="en-US"/>
+        </w:rPr>
+        <w:t>电邮</w:t>
+      </w:r>
+      <w:r>
+        <w:rPr>
+          <w:rFonts w:ascii="Noto Serif" w:eastAsia="Noto Serif SC" w:hAnsi="Noto Serif" w:cs="Noto Serif"/>
+          <w:sz w:val="20"/>
+          <w:szCs w:val="20"/>
+          <w:lang w:val="en-US"/>
+        </w:rPr>
+        <w:t>Email: </w:t>
+      </w:r>
+      <w:hyperlink r:id="rId11" w:tgtFrame="_blank" w:history="1">
+        <w:r>
+          <w:rPr>
+            <w:rStyle w:val="Hyperlink"/>
+            <w:rFonts w:ascii="Noto Serif" w:eastAsia="Noto Serif SC" w:hAnsi="Noto Serif" w:cs="Noto Serif"/>
+            <w:sz w:val="20"/>
+            <w:szCs w:val="20"/>
+            <w:lang w:val="en-US"/>
+          </w:rPr>
+          <w:t>aa@sco.com.sg</w:t>
+        </w:r>
+      </w:hyperlink>
+    </w:p>
+    <w:p>
+      <w:pPr>
+        <w:rPr>
+          <w:rFonts w:ascii="Noto Serif" w:eastAsia="Noto Serif SC" w:hAnsi="Noto Serif" w:cs="Noto Serif"/>
+          <w:sz w:val="20"/>
+          <w:szCs w:val="20"/>
+          <w:lang w:val="en-US"/>
+        </w:rPr>
+      </w:pPr>
+      <w:r>
+        <w:rPr>
+          <w:rFonts w:ascii="Noto Serif" w:eastAsia="Noto Serif SC" w:hAnsi="Noto Serif" w:cs="Noto Serif"/>
+          <w:sz w:val="20"/>
+          <w:szCs w:val="20"/>
+          <w:lang w:val="en-US"/>
+        </w:rPr>
+        <w:t>电话</w:t>
+      </w:r>
+      <w:r>
+        <w:rPr>
+          <w:rFonts w:ascii="Noto Serif" w:eastAsia="Noto Serif SC" w:hAnsi="Noto Serif" w:cs="Noto Serif"/>
+          <w:sz w:val="20"/>
+          <w:szCs w:val="20"/>
+          <w:lang w:val="en-US"/>
+        </w:rPr>
+        <w:t>Telephone: (65) 6557 4025</w:t>
+      </w:r>
+    </w:p>
+    <w:p>
+      <w:pPr>
+        <w:rPr>
+          <w:rFonts w:ascii="Noto Serif" w:eastAsia="Noto Serif SC" w:hAnsi="Noto Serif" w:cs="Noto Serif"/>
+          <w:sz w:val="20"/>
+          <w:szCs w:val="20"/>
+          <w:lang w:val="en-US"/>
         </w:rPr>
         <w:sectPr>
           <w:pgSz w:w="16840" w:h="23820"/>
@@ -1472,6 +1743,33 @@
           <w:docGrid w:linePitch="360"/>
         </w:sectPr>
       </w:pPr>
+      <w:r>
+        <w:rPr>
+          <w:rFonts w:ascii="Noto Serif" w:eastAsia="Noto Serif SC" w:hAnsi="Noto Serif" w:cs="Noto Serif"/>
+          <w:sz w:val="20"/>
+          <w:szCs w:val="20"/>
+          <w:lang w:val="en-US"/>
+        </w:rPr>
+        <w:t>传真</w:t>
+      </w:r>
+      <w:r>
+        <w:rPr>
+          <w:rFonts w:ascii="Noto Serif" w:eastAsia="Noto Serif SC" w:hAnsi="Noto Serif" w:cs="Noto Serif"/>
+          <w:sz w:val="20"/>
+          <w:szCs w:val="20"/>
+          <w:lang w:val="en-US"/>
+        </w:rPr>
+        <w:t>Fax: (65) 6557 275</w:t>
+      </w:r>
+      <w:r>
+        <w:rPr>
+          <w:rFonts w:ascii="Noto Serif" w:eastAsia="Noto Serif SC" w:hAnsi="Noto Serif" w:cs="Noto Serif"/>
+          <w:sz w:val="20"/>
+          <w:szCs w:val="20"/>
+          <w:lang w:val="en-US"/>
+        </w:rPr>
+        <w:t>6</w:t>
+      </w:r>
     </w:p>
     <w:p>
       <w:pPr>
@@ -1659,8 +1957,6 @@
       <w:r>
         <w:rPr>
           <w:rFonts w:ascii="Noto Serif" w:eastAsia="Noto Serif SC" w:hAnsi="Noto Serif"/>
-          <w:i/>
-          <w:iCs/>
           <w:sz w:val="24"/>
           <w:szCs w:val="24"/>
         </w:rPr>
@@ -1670,8 +1966,6 @@
       <w:r>
         <w:rPr>
           <w:rFonts w:ascii="Noto Serif" w:eastAsia="Noto Serif SC" w:hAnsi="Noto Serif"/>
-          <w:i/>
-          <w:iCs/>
           <w:sz w:val="24"/>
           <w:szCs w:val="24"/>
         </w:rPr>
@@ -1681,8 +1975,6 @@
       <w:r>
         <w:rPr>
           <w:rFonts w:ascii="Noto Serif" w:eastAsia="Noto Serif SC" w:hAnsi="Noto Serif"/>
-          <w:i/>
-          <w:iCs/>
           <w:sz w:val="24"/>
           <w:szCs w:val="24"/>
         </w:rPr>
@@ -1974,132 +2266,10 @@
       <w:r>
         <w:rPr>
           <w:rFonts w:ascii="Noto Serif" w:eastAsia="Noto Serif SC" w:hAnsi="Noto Serif" w:cs="Noto Serif"/>
-          <w:i/>
-          <w:iCs/>
-          <w:sz w:val="24"/>
-          <w:szCs w:val="24"/>
-        </w:rPr>
-        <w:t xml:space="preserve">Singapore’s multi-racial culture left a deep impression on the composer. Born in the southern part of Fujian province but brought up in the Shanghai metropolis, the composer was strongly attracted and took a special liking to </w:t>
-      </w:r>
-      <w:r>
-        <w:rPr>
-          <w:rFonts w:ascii="Noto Serif" w:eastAsia="Noto Serif SC" w:hAnsi="Noto Serif" w:cs="Noto Serif"/>
-          <w:i/>
-          <w:iCs/>
-          <w:sz w:val="24"/>
-          <w:szCs w:val="24"/>
-        </w:rPr>
-        <w:t>S</w:t>
-      </w:r>
-      <w:r>
-        <w:rPr>
-          <w:rFonts w:ascii="Noto Serif" w:eastAsia="Noto Serif SC" w:hAnsi="Noto Serif" w:cs="Noto Serif"/>
-          <w:i/>
-          <w:iCs/>
-          <w:sz w:val="24"/>
-          <w:szCs w:val="24"/>
-        </w:rPr>
-        <w:t>ingapore’s</w:t>
-      </w:r>
-      <w:r>
-        <w:rPr>
-          <w:rFonts w:ascii="Noto Serif" w:eastAsia="Noto Serif SC" w:hAnsi="Noto Serif" w:cs="Noto Serif"/>
-          <w:i/>
-          <w:iCs/>
-          <w:sz w:val="24"/>
-          <w:szCs w:val="24"/>
-        </w:rPr>
-        <w:t xml:space="preserve"> </w:t>
-      </w:r>
-      <w:r>
-        <w:rPr>
-          <w:rFonts w:ascii="Noto Serif" w:eastAsia="Noto Serif SC" w:hAnsi="Noto Serif" w:cs="Noto Serif"/>
-          <w:i/>
-          <w:iCs/>
-          <w:sz w:val="24"/>
-          <w:szCs w:val="24"/>
-        </w:rPr>
-        <w:t>rich flavour of a modern metropolis with an eastern China’s cultural atmosphere. The composition</w:t>
-      </w:r>
-      <w:r>
-        <w:rPr>
-          <w:rFonts w:ascii="Noto Serif" w:eastAsia="Noto Serif SC" w:hAnsi="Noto Serif" w:cs="Noto Serif"/>
-          <w:i/>
-          <w:iCs/>
-          <w:sz w:val="24"/>
-          <w:szCs w:val="24"/>
-        </w:rPr>
-        <w:t xml:space="preserve"> e</w:t>
-      </w:r>
-      <w:r>
-        <w:rPr>
-          <w:rFonts w:ascii="Noto Serif" w:eastAsia="Noto Serif SC" w:hAnsi="Noto Serif" w:cs="Noto Serif"/>
-          <w:i/>
-          <w:iCs/>
-          <w:sz w:val="24"/>
-          <w:szCs w:val="24"/>
-        </w:rPr>
-        <w:t>mphasises the vibrant, elegant and bustling city life and describes the charms of Nanyang. It depicts scenes of its rich</w:t>
-      </w:r>
-      <w:r>
-        <w:rPr>
-          <w:rFonts w:ascii="Noto Serif" w:eastAsia="Noto Serif SC" w:hAnsi="Noto Serif" w:cs="Noto Serif"/>
-          <w:i/>
-          <w:iCs/>
-          <w:sz w:val="24"/>
-          <w:szCs w:val="24"/>
-        </w:rPr>
-        <w:t xml:space="preserve"> </w:t>
-      </w:r>
-      <w:r>
-        <w:rPr>
-          <w:rFonts w:ascii="Noto Serif" w:eastAsia="Noto Serif SC" w:hAnsi="Noto Serif" w:cs="Noto Serif"/>
-          <w:i/>
-          <w:iCs/>
-          <w:sz w:val="24"/>
-          <w:szCs w:val="24"/>
-        </w:rPr>
-        <w:t>and diverse sentiments, integrated with aspects of traditional Chinese culture. The composer adopts an array of</w:t>
-      </w:r>
-      <w:r>
-        <w:rPr>
-          <w:rFonts w:ascii="Noto Serif" w:eastAsia="Noto Serif SC" w:hAnsi="Noto Serif" w:cs="Noto Serif"/>
-          <w:i/>
-          <w:iCs/>
-          <w:sz w:val="24"/>
-          <w:szCs w:val="24"/>
-        </w:rPr>
-        <w:t xml:space="preserve"> </w:t>
-      </w:r>
-      <w:r>
-        <w:rPr>
-          <w:rFonts w:ascii="Noto Serif" w:eastAsia="Noto Serif SC" w:hAnsi="Noto Serif" w:cs="Noto Serif"/>
-          <w:i/>
-          <w:iCs/>
-          <w:sz w:val="24"/>
-          <w:szCs w:val="24"/>
-        </w:rPr>
-        <w:t>composition techniques with a combination of elements from various influences, including the southern Chinese,</w:t>
-      </w:r>
-      <w:r>
-        <w:rPr>
-          <w:rFonts w:ascii="Noto Serif" w:eastAsia="Noto Serif SC" w:hAnsi="Noto Serif" w:cs="Noto Serif"/>
-          <w:i/>
-          <w:iCs/>
-          <w:sz w:val="24"/>
-          <w:szCs w:val="24"/>
-        </w:rPr>
-        <w:t xml:space="preserve"> </w:t>
-      </w:r>
-      <w:r>
-        <w:rPr>
-          <w:rFonts w:ascii="Noto Serif" w:eastAsia="Noto Serif SC" w:hAnsi="Noto Serif" w:cs="Noto Serif"/>
-          <w:i/>
-          <w:iCs/>
-          <w:sz w:val="24"/>
-          <w:szCs w:val="24"/>
-        </w:rPr>
-        <w:t>western modern, classical and romantic music to reflect the diversity and inner spirit of Singapore. This piece won the First Prize at the Singapore International Competition for Chinese Orchestral Composition 2011.</w:t>
+          <w:sz w:val="24"/>
+          <w:szCs w:val="24"/>
+        </w:rPr>
+        <w:t>Singapore’s multi-racial culture left a deep impression on the composer. Born in the southern part of Fujian province but brought up in the Shanghai metropolis, the composer was strongly attracted and took a special liking to Singapore’s rich flavour of a modern metropolis with an eastern China’s cultural atmosphere. The composition emphasises the vibrant, elegant and bustling city life and describes the charms of Nanyang. It depicts scenes of its rich and diverse sentiments, integrated with aspects of traditional Chinese culture. The composer adopts an array of composition techniques with a combination of elements from various influences, including the southern Chinese, western modern, classical and romantic music to reflect the diversity and inner spirit of Singapore. This piece won the First Prize at the Singapore International Competition for Chinese Orchestral Composition 2011.</w:t>
       </w:r>
       <w:r>
         <w:rPr>
@@ -2777,13 +2947,23 @@
         </w:rPr>
         <w:t>(</w:t>
       </w:r>
-      <w:r>
-        <w:rPr>
-          <w:rFonts w:ascii="Noto Serif" w:eastAsia="Noto Serif SC" w:hAnsi="Noto Serif" w:cs="Noto Serif"/>
-          <w:sz w:val="24"/>
-          <w:szCs w:val="24"/>
-        </w:rPr>
-        <w:t xml:space="preserve">Diyin </w:t>
+      <w:proofErr w:type="spellStart"/>
+      <w:r>
+        <w:rPr>
+          <w:rFonts w:ascii="Noto Serif" w:eastAsia="Noto Serif SC" w:hAnsi="Noto Serif" w:cs="Noto Serif"/>
+          <w:sz w:val="24"/>
+          <w:szCs w:val="24"/>
+        </w:rPr>
+        <w:t>Diyin</w:t>
+      </w:r>
+      <w:proofErr w:type="spellEnd"/>
+      <w:r>
+        <w:rPr>
+          <w:rFonts w:ascii="Noto Serif" w:eastAsia="Noto Serif SC" w:hAnsi="Noto Serif" w:cs="Noto Serif"/>
+          <w:sz w:val="24"/>
+          <w:szCs w:val="24"/>
+        </w:rPr>
+        <w:t xml:space="preserve"> </w:t>
       </w:r>
       <w:proofErr w:type="spellStart"/>
       <w:r>
@@ -4956,6 +5136,29 @@
       <w:contextualSpacing/>
     </w:pPr>
   </w:style>
+  <w:style w:type="character" w:styleId="Hyperlink">
+    <w:name w:val="Hyperlink"/>
+    <w:basedOn w:val="DefaultParagraphFont"/>
+    <w:uiPriority w:val="99"/>
+    <w:unhideWhenUsed/>
+    <w:rsid w:val="00FB50C1"/>
+    <w:rPr>
+      <w:color w:val="0563C1" w:themeColor="hyperlink"/>
+      <w:u w:val="single"/>
+    </w:rPr>
+  </w:style>
+  <w:style w:type="character" w:styleId="UnresolvedMention">
+    <w:name w:val="Unresolved Mention"/>
+    <w:basedOn w:val="DefaultParagraphFont"/>
+    <w:uiPriority w:val="99"/>
+    <w:semiHidden/>
+    <w:unhideWhenUsed/>
+    <w:rsid w:val="00FB50C1"/>
+    <w:rPr>
+      <w:color w:val="605E5C"/>
+      <w:shd w:val="clear" w:color="auto" w:fill="E1DFDD"/>
+    </w:rPr>
+  </w:style>
 </w:styles>
 </file>
 

</xml_diff>

<commit_message>
Piece 1 Front Matter Edited - Photo missing
</commit_message>
<xml_diff>
--- a/Front Matter/Template/1_Front-Matter_Template-v4.docx
+++ b/Front Matter/Template/1_Front-Matter_Template-v4.docx
@@ -340,6 +340,76 @@
           <w:sz w:val="18"/>
         </w:rPr>
       </w:pPr>
+      <w:r>
+        <w:rPr>
+          <w:rFonts w:ascii="STKaiti" w:eastAsia="STKaiti" w:cs="STKaiti" w:hint="eastAsia"/>
+          <w:noProof/>
+          <w:sz w:val="144"/>
+          <w:szCs w:val="72"/>
+        </w:rPr>
+        <w:drawing>
+          <wp:anchor distT="0" distB="0" distL="114300" distR="114300" simplePos="0" relativeHeight="251658240" behindDoc="0" locked="0" layoutInCell="1" allowOverlap="1" wp14:anchorId="6AC9F7E2" wp14:editId="0853A22D">
+            <wp:simplePos x="0" y="0"/>
+            <wp:positionH relativeFrom="margin">
+              <wp:align>center</wp:align>
+            </wp:positionH>
+            <wp:positionV relativeFrom="margin">
+              <wp:align>bottom</wp:align>
+            </wp:positionV>
+            <wp:extent cx="1947886" cy="2372348"/>
+            <wp:effectExtent l="0" t="0" r="0" b="3175"/>
+            <wp:wrapSquare wrapText="bothSides"/>
+            <wp:docPr id="1013639289" name="Picture 1013639289" descr="A logo of a musical instrument&#10;&#10;Description automatically generated"/>
+            <wp:cNvGraphicFramePr>
+              <a:graphicFrameLocks xmlns:a="http://schemas.openxmlformats.org/drawingml/2006/main" noChangeAspect="1"/>
+            </wp:cNvGraphicFramePr>
+            <a:graphic xmlns:a="http://schemas.openxmlformats.org/drawingml/2006/main">
+              <a:graphicData uri="http://schemas.openxmlformats.org/drawingml/2006/picture">
+                <pic:pic xmlns:pic="http://schemas.openxmlformats.org/drawingml/2006/picture">
+                  <pic:nvPicPr>
+                    <pic:cNvPr id="1013639289" name="Picture 1013639289" descr="A logo of a musical instrument&#10;&#10;Description automatically generated"/>
+                    <pic:cNvPicPr>
+                      <a:picLocks noChangeAspect="1" noChangeArrowheads="1"/>
+                    </pic:cNvPicPr>
+                  </pic:nvPicPr>
+                  <pic:blipFill>
+                    <a:blip r:embed="rId8" cstate="print">
+                      <a:extLst>
+                        <a:ext uri="{28A0092B-C50C-407E-A947-70E740481C1C}">
+                          <a14:useLocalDpi xmlns:a14="http://schemas.microsoft.com/office/drawing/2010/main" val="0"/>
+                        </a:ext>
+                      </a:extLst>
+                    </a:blip>
+                    <a:srcRect/>
+                    <a:stretch>
+                      <a:fillRect/>
+                    </a:stretch>
+                  </pic:blipFill>
+                  <pic:spPr bwMode="auto">
+                    <a:xfrm>
+                      <a:off x="0" y="0"/>
+                      <a:ext cx="1947886" cy="2372348"/>
+                    </a:xfrm>
+                    <a:prstGeom prst="rect">
+                      <a:avLst/>
+                    </a:prstGeom>
+                    <a:noFill/>
+                    <a:ln>
+                      <a:noFill/>
+                    </a:ln>
+                  </pic:spPr>
+                </pic:pic>
+              </a:graphicData>
+            </a:graphic>
+            <wp14:sizeRelH relativeFrom="page">
+              <wp14:pctWidth>0</wp14:pctWidth>
+            </wp14:sizeRelH>
+            <wp14:sizeRelV relativeFrom="page">
+              <wp14:pctHeight>0</wp14:pctHeight>
+            </wp14:sizeRelV>
+          </wp:anchor>
+        </w:drawing>
+      </w:r>
     </w:p>
     <w:p>
       <w:pPr>
@@ -348,8 +418,8 @@
           <w:sz w:val="18"/>
         </w:rPr>
         <w:sectPr>
-          <w:headerReference w:type="default" r:id="rId8"/>
-          <w:footerReference w:type="default" r:id="rId9"/>
+          <w:headerReference w:type="default" r:id="rId9"/>
+          <w:footerReference w:type="default" r:id="rId10"/>
           <w:pgSz w:w="16840" w:h="23820"/>
           <w:pgMar w:top="1440" w:right="1800" w:bottom="1440" w:left="1800" w:header="706" w:footer="1411" w:gutter="0"/>
           <w:cols w:space="708"/>
@@ -1109,7 +1179,6 @@
           <w:b/>
           <w:bCs/>
           <w:color w:val="000000" w:themeColor="text1"/>
-          <w:szCs w:val="32"/>
           <w:lang w:val="en-GB"/>
         </w:rPr>
       </w:pPr>
@@ -1119,7 +1188,6 @@
           <w:b/>
           <w:bCs/>
           <w:color w:val="000000" w:themeColor="text1"/>
-          <w:szCs w:val="32"/>
         </w:rPr>
         <w:lastRenderedPageBreak/>
         <w:t>狮城漫步</w:t>
@@ -1133,7 +1201,7 @@
           <w:bCs/>
           <w:color w:val="000000" w:themeColor="text1"/>
           <w:sz w:val="20"/>
-          <w:szCs w:val="24"/>
+          <w:szCs w:val="20"/>
         </w:rPr>
       </w:pPr>
       <w:r>
@@ -1143,7 +1211,7 @@
           <w:bCs/>
           <w:color w:val="000000" w:themeColor="text1"/>
           <w:sz w:val="20"/>
-          <w:szCs w:val="24"/>
+          <w:szCs w:val="20"/>
         </w:rPr>
         <w:t>A Stroll in the Lion City</w:t>
       </w:r>
@@ -1154,7 +1222,7 @@
           <w:rFonts w:ascii="Noto Serif" w:eastAsia="Noto Serif SC" w:hAnsi="Noto Serif" w:cs="Noto Serif"/>
           <w:color w:val="000000" w:themeColor="text1"/>
           <w:sz w:val="20"/>
-          <w:szCs w:val="24"/>
+          <w:szCs w:val="20"/>
           <w:lang w:val="en-GB"/>
         </w:rPr>
       </w:pPr>
@@ -1165,7 +1233,7 @@
           <w:rFonts w:ascii="Noto Serif" w:eastAsia="Noto Serif SC" w:hAnsi="Noto Serif" w:cs="Noto Serif"/>
           <w:color w:val="000000" w:themeColor="text1"/>
           <w:sz w:val="20"/>
-          <w:szCs w:val="24"/>
+          <w:szCs w:val="20"/>
         </w:rPr>
       </w:pPr>
       <w:r>
@@ -1173,7 +1241,7 @@
           <w:rFonts w:ascii="Noto Serif" w:eastAsia="Noto Serif SC" w:hAnsi="Noto Serif" w:cs="Noto Serif"/>
           <w:color w:val="000000" w:themeColor="text1"/>
           <w:sz w:val="20"/>
-          <w:szCs w:val="24"/>
+          <w:szCs w:val="20"/>
         </w:rPr>
         <w:t>ISMN</w:t>
       </w:r>
@@ -1184,7 +1252,7 @@
           <w:rFonts w:ascii="Noto Serif" w:eastAsia="Noto Serif SC" w:hAnsi="Noto Serif" w:cs="Noto Serif"/>
           <w:color w:val="000000" w:themeColor="text1"/>
           <w:sz w:val="20"/>
-          <w:szCs w:val="24"/>
+          <w:szCs w:val="20"/>
         </w:rPr>
       </w:pPr>
     </w:p>
@@ -1194,7 +1262,7 @@
           <w:rFonts w:ascii="Noto Serif" w:eastAsia="Noto Serif SC" w:hAnsi="Noto Serif" w:cs="Noto Serif"/>
           <w:color w:val="000000" w:themeColor="text1"/>
           <w:sz w:val="20"/>
-          <w:szCs w:val="24"/>
+          <w:szCs w:val="20"/>
         </w:rPr>
       </w:pPr>
       <w:r>
@@ -1202,7 +1270,7 @@
           <w:rFonts w:ascii="Noto Serif" w:eastAsia="Noto Serif SC" w:hAnsi="Noto Serif" w:cs="Noto Serif"/>
           <w:color w:val="000000" w:themeColor="text1"/>
           <w:sz w:val="20"/>
-          <w:szCs w:val="24"/>
+          <w:szCs w:val="20"/>
         </w:rPr>
         <w:t xml:space="preserve">Copyright © Singapore Chinese Orchestra </w:t>
       </w:r>
@@ -1211,7 +1279,7 @@
           <w:rFonts w:ascii="Noto Serif" w:eastAsia="Noto Serif SC" w:hAnsi="Noto Serif" w:cs="Noto Serif"/>
           <w:color w:val="000000" w:themeColor="text1"/>
           <w:sz w:val="20"/>
-          <w:szCs w:val="24"/>
+          <w:szCs w:val="20"/>
         </w:rPr>
         <w:t xml:space="preserve">Co. </w:t>
       </w:r>
@@ -1220,7 +1288,7 @@
           <w:rFonts w:ascii="Noto Serif" w:eastAsia="Noto Serif SC" w:hAnsi="Noto Serif" w:cs="Noto Serif"/>
           <w:color w:val="000000" w:themeColor="text1"/>
           <w:sz w:val="20"/>
-          <w:szCs w:val="24"/>
+          <w:szCs w:val="20"/>
         </w:rPr>
         <w:t>Ltd. All rights reserved.</w:t>
       </w:r>
@@ -1229,7 +1297,7 @@
           <w:rFonts w:ascii="Noto Serif" w:eastAsia="Noto Serif SC" w:hAnsi="Noto Serif" w:cs="Noto Serif"/>
           <w:color w:val="000000" w:themeColor="text1"/>
           <w:sz w:val="20"/>
-          <w:szCs w:val="24"/>
+          <w:szCs w:val="20"/>
         </w:rPr>
         <w:t xml:space="preserve"> </w:t>
       </w:r>
@@ -1240,7 +1308,7 @@
           <w:rFonts w:ascii="Noto Serif" w:eastAsia="Noto Serif SC" w:hAnsi="Noto Serif" w:cs="Noto Serif"/>
           <w:color w:val="000000" w:themeColor="text1"/>
           <w:sz w:val="20"/>
-          <w:szCs w:val="24"/>
+          <w:szCs w:val="20"/>
         </w:rPr>
       </w:pPr>
     </w:p>
@@ -1249,7 +1317,8 @@
         <w:rPr>
           <w:rFonts w:ascii="Noto Serif" w:eastAsia="Noto Serif SC" w:hAnsi="Noto Serif" w:cs="Noto Serif"/>
           <w:color w:val="000000" w:themeColor="text1"/>
-          <w:szCs w:val="32"/>
+          <w:sz w:val="20"/>
+          <w:szCs w:val="20"/>
           <w:lang w:val="en-US"/>
         </w:rPr>
       </w:pPr>
@@ -1257,7 +1326,8 @@
         <w:rPr>
           <w:rFonts w:ascii="Noto Serif" w:eastAsia="Noto Serif SC" w:hAnsi="Noto Serif" w:cs="Noto Serif"/>
           <w:color w:val="000000" w:themeColor="text1"/>
-          <w:szCs w:val="32"/>
+          <w:sz w:val="20"/>
+          <w:szCs w:val="20"/>
         </w:rPr>
         <w:t>版权所有</w:t>
       </w:r>
@@ -1265,7 +1335,8 @@
         <w:rPr>
           <w:rFonts w:ascii="Noto Serif" w:eastAsia="Noto Serif SC" w:hAnsi="Noto Serif" w:cs="Noto Serif"/>
           <w:color w:val="000000" w:themeColor="text1"/>
-          <w:szCs w:val="32"/>
+          <w:sz w:val="20"/>
+          <w:szCs w:val="20"/>
         </w:rPr>
         <w:t xml:space="preserve">, </w:t>
       </w:r>
@@ -1273,7 +1344,8 @@
         <w:rPr>
           <w:rFonts w:ascii="Noto Serif" w:eastAsia="Noto Serif SC" w:hAnsi="Noto Serif" w:cs="Noto Serif"/>
           <w:color w:val="000000" w:themeColor="text1"/>
-          <w:szCs w:val="32"/>
+          <w:sz w:val="20"/>
+          <w:szCs w:val="20"/>
         </w:rPr>
         <w:t>未经许可</w:t>
       </w:r>
@@ -1281,7 +1353,8 @@
         <w:rPr>
           <w:rFonts w:ascii="Noto Serif" w:eastAsia="Noto Serif SC" w:hAnsi="Noto Serif" w:cs="Noto Serif"/>
           <w:color w:val="000000" w:themeColor="text1"/>
-          <w:szCs w:val="32"/>
+          <w:sz w:val="20"/>
+          <w:szCs w:val="20"/>
         </w:rPr>
         <w:t xml:space="preserve">, </w:t>
       </w:r>
@@ -1289,18 +1362,20 @@
         <w:rPr>
           <w:rFonts w:ascii="Noto Serif" w:eastAsia="Noto Serif SC" w:hAnsi="Noto Serif" w:cs="Noto Serif"/>
           <w:color w:val="000000" w:themeColor="text1"/>
-          <w:szCs w:val="32"/>
+          <w:sz w:val="20"/>
+          <w:szCs w:val="20"/>
         </w:rPr>
         <w:t>不得以任何形式印刷、复制、扫描或发行。</w:t>
       </w:r>
     </w:p>
     <w:p>
       <w:pPr>
+        <w:spacing w:line="276" w:lineRule="auto"/>
         <w:rPr>
           <w:rFonts w:ascii="Noto Serif" w:eastAsia="Noto Serif SC" w:hAnsi="Noto Serif" w:cs="Noto Serif"/>
           <w:color w:val="000000" w:themeColor="text1"/>
           <w:sz w:val="20"/>
-          <w:szCs w:val="24"/>
+          <w:szCs w:val="20"/>
         </w:rPr>
       </w:pPr>
       <w:r>
@@ -1308,7 +1383,7 @@
           <w:rFonts w:ascii="Noto Serif" w:eastAsia="Noto Serif SC" w:hAnsi="Noto Serif" w:cs="Noto Serif"/>
           <w:color w:val="000000" w:themeColor="text1"/>
           <w:sz w:val="20"/>
-          <w:szCs w:val="24"/>
+          <w:szCs w:val="20"/>
         </w:rPr>
         <w:t>Unauthorised printing, reproduction, scanning or distribution is strictly prohibited</w:t>
       </w:r>
@@ -1317,18 +1392,19 @@
           <w:rFonts w:ascii="Noto Serif" w:eastAsia="Noto Serif SC" w:hAnsi="Noto Serif" w:cs="Noto Serif"/>
           <w:color w:val="000000" w:themeColor="text1"/>
           <w:sz w:val="20"/>
-          <w:szCs w:val="24"/>
+          <w:szCs w:val="20"/>
         </w:rPr>
         <w:t xml:space="preserve"> </w:t>
       </w:r>
     </w:p>
     <w:p>
       <w:pPr>
+        <w:spacing w:line="276" w:lineRule="auto"/>
         <w:rPr>
           <w:rFonts w:ascii="Noto Serif" w:eastAsia="Noto Serif SC" w:hAnsi="Noto Serif" w:cs="Noto Serif"/>
           <w:color w:val="000000" w:themeColor="text1"/>
           <w:sz w:val="20"/>
-          <w:szCs w:val="24"/>
+          <w:szCs w:val="20"/>
         </w:rPr>
       </w:pPr>
       <w:r>
@@ -1336,7 +1412,7 @@
           <w:rFonts w:ascii="Noto Serif" w:eastAsia="Noto Serif SC" w:hAnsi="Noto Serif" w:cs="Noto Serif"/>
           <w:color w:val="000000" w:themeColor="text1"/>
           <w:sz w:val="20"/>
-          <w:szCs w:val="24"/>
+          <w:szCs w:val="20"/>
         </w:rPr>
         <w:t>without the express permission of the copyright holder.</w:t>
       </w:r>
@@ -1347,7 +1423,7 @@
           <w:rFonts w:ascii="Noto Serif" w:eastAsia="Noto Serif SC" w:hAnsi="Noto Serif" w:cs="Noto Serif"/>
           <w:color w:val="000000" w:themeColor="text1"/>
           <w:sz w:val="20"/>
-          <w:szCs w:val="24"/>
+          <w:szCs w:val="20"/>
         </w:rPr>
       </w:pPr>
     </w:p>
@@ -1357,7 +1433,7 @@
           <w:rFonts w:ascii="Noto Serif SC" w:eastAsia="Noto Serif SC" w:hAnsi="Noto Serif SC" w:cs="Noto Serif"/>
           <w:color w:val="000000" w:themeColor="text1"/>
           <w:sz w:val="20"/>
-          <w:szCs w:val="24"/>
+          <w:szCs w:val="20"/>
           <w:lang w:val="en-US"/>
         </w:rPr>
       </w:pPr>
@@ -1366,7 +1442,7 @@
           <w:rFonts w:ascii="Noto Serif SC" w:eastAsia="Noto Serif SC" w:hAnsi="Noto Serif SC" w:cs="Noto Serif"/>
           <w:color w:val="000000" w:themeColor="text1"/>
           <w:sz w:val="20"/>
-          <w:szCs w:val="24"/>
+          <w:szCs w:val="20"/>
         </w:rPr>
         <w:t>印刷于新加坡。</w:t>
       </w:r>
@@ -1374,31 +1450,46 @@
     <w:p>
       <w:pPr>
         <w:rPr>
-          <w:rFonts w:ascii="Noto Serif SC" w:eastAsia="Noto Serif SC" w:hAnsi="Noto Serif SC" w:cs="Noto Serif"/>
+          <w:rFonts w:ascii="Noto Serif" w:eastAsia="Noto Serif SC" w:hAnsi="Noto Serif" w:cs="Noto Serif"/>
+        </w:rPr>
+      </w:pPr>
+      <w:r>
+        <w:rPr>
+          <w:rFonts w:ascii="Noto Serif" w:eastAsia="Noto Serif SC" w:hAnsi="Noto Serif" w:cs="Noto Serif"/>
+        </w:rPr>
+        <w:t>Printed in Singapore.</w:t>
+      </w:r>
+    </w:p>
+    <w:p>
+      <w:pPr>
+        <w:rPr>
+          <w:rFonts w:ascii="Noto Serif" w:eastAsia="Noto Serif SC" w:hAnsi="Noto Serif" w:cs="Noto Serif"/>
           <w:color w:val="000000" w:themeColor="text1"/>
           <w:sz w:val="20"/>
-          <w:szCs w:val="24"/>
-        </w:rPr>
-      </w:pPr>
-      <w:r>
-        <w:rPr>
-          <w:rFonts w:ascii="Noto Serif SC" w:eastAsia="Noto Serif SC" w:hAnsi="Noto Serif SC" w:cs="Noto Serif"/>
+          <w:szCs w:val="20"/>
+        </w:rPr>
+      </w:pPr>
+    </w:p>
+    <w:p>
+      <w:pPr>
+        <w:rPr>
+          <w:rFonts w:ascii="Noto Serif" w:eastAsia="Noto Serif SC" w:hAnsi="Noto Serif" w:cs="Noto Serif"/>
           <w:color w:val="000000" w:themeColor="text1"/>
           <w:sz w:val="20"/>
-          <w:szCs w:val="24"/>
-        </w:rPr>
-        <w:t>Printed in Singapore.</w:t>
-      </w:r>
-    </w:p>
-    <w:p>
-      <w:pPr>
+          <w:szCs w:val="20"/>
+          <w:lang w:val="en-US"/>
+        </w:rPr>
+      </w:pPr>
+      <w:r>
         <w:rPr>
           <w:rFonts w:ascii="Noto Serif" w:eastAsia="Noto Serif SC" w:hAnsi="Noto Serif" w:cs="Noto Serif"/>
           <w:color w:val="000000" w:themeColor="text1"/>
           <w:sz w:val="20"/>
-          <w:szCs w:val="24"/>
-        </w:rPr>
-      </w:pPr>
+          <w:szCs w:val="20"/>
+          <w:lang w:val="en-US"/>
+        </w:rPr>
+        <w:t>新加坡华乐团有限公司</w:t>
+      </w:r>
     </w:p>
     <w:p>
       <w:pPr>
@@ -1406,7 +1497,7 @@
           <w:rFonts w:ascii="Noto Serif" w:eastAsia="Noto Serif SC" w:hAnsi="Noto Serif" w:cs="Noto Serif"/>
           <w:color w:val="000000" w:themeColor="text1"/>
           <w:sz w:val="20"/>
-          <w:szCs w:val="24"/>
+          <w:szCs w:val="20"/>
           <w:lang w:val="en-US"/>
         </w:rPr>
       </w:pPr>
@@ -1415,51 +1506,51 @@
           <w:rFonts w:ascii="Noto Serif" w:eastAsia="Noto Serif SC" w:hAnsi="Noto Serif" w:cs="Noto Serif"/>
           <w:color w:val="000000" w:themeColor="text1"/>
           <w:sz w:val="20"/>
-          <w:szCs w:val="24"/>
-          <w:lang w:val="en-US"/>
-        </w:rPr>
-        <w:t>新加坡华乐团有限公司</w:t>
-      </w:r>
-    </w:p>
-    <w:p>
-      <w:pPr>
+          <w:szCs w:val="20"/>
+          <w:lang w:val="en-US"/>
+        </w:rPr>
+        <w:t>珊顿道</w:t>
+      </w:r>
+      <w:r>
         <w:rPr>
           <w:rFonts w:ascii="Noto Serif" w:eastAsia="Noto Serif SC" w:hAnsi="Noto Serif" w:cs="Noto Serif"/>
           <w:color w:val="000000" w:themeColor="text1"/>
           <w:sz w:val="20"/>
-          <w:szCs w:val="24"/>
-          <w:lang w:val="en-US"/>
-        </w:rPr>
-      </w:pPr>
+          <w:szCs w:val="20"/>
+          <w:lang w:val="en-US"/>
+        </w:rPr>
+        <w:t>7</w:t>
+      </w:r>
       <w:r>
         <w:rPr>
           <w:rFonts w:ascii="Noto Serif" w:eastAsia="Noto Serif SC" w:hAnsi="Noto Serif" w:cs="Noto Serif"/>
           <w:color w:val="000000" w:themeColor="text1"/>
           <w:sz w:val="20"/>
-          <w:szCs w:val="24"/>
-          <w:lang w:val="en-US"/>
-        </w:rPr>
-        <w:t>珊顿道</w:t>
-      </w:r>
-      <w:r>
+          <w:szCs w:val="20"/>
+          <w:lang w:val="en-US"/>
+        </w:rPr>
+        <w:t>号</w:t>
+      </w:r>
+    </w:p>
+    <w:p>
+      <w:pPr>
         <w:rPr>
           <w:rFonts w:ascii="Noto Serif" w:eastAsia="Noto Serif SC" w:hAnsi="Noto Serif" w:cs="Noto Serif"/>
           <w:color w:val="000000" w:themeColor="text1"/>
           <w:sz w:val="20"/>
-          <w:szCs w:val="24"/>
-          <w:lang w:val="en-US"/>
-        </w:rPr>
-        <w:t>7</w:t>
-      </w:r>
+          <w:szCs w:val="20"/>
+          <w:lang w:val="en-US"/>
+        </w:rPr>
+      </w:pPr>
       <w:r>
         <w:rPr>
           <w:rFonts w:ascii="Noto Serif" w:eastAsia="Noto Serif SC" w:hAnsi="Noto Serif" w:cs="Noto Serif"/>
           <w:color w:val="000000" w:themeColor="text1"/>
           <w:sz w:val="20"/>
-          <w:szCs w:val="24"/>
-          <w:lang w:val="en-US"/>
-        </w:rPr>
-        <w:t>号</w:t>
+          <w:szCs w:val="20"/>
+          <w:lang w:val="en-US"/>
+        </w:rPr>
+        <w:t>新加坡大会堂</w:t>
       </w:r>
     </w:p>
     <w:p>
@@ -1468,7 +1559,7 @@
           <w:rFonts w:ascii="Noto Serif" w:eastAsia="Noto Serif SC" w:hAnsi="Noto Serif" w:cs="Noto Serif"/>
           <w:color w:val="000000" w:themeColor="text1"/>
           <w:sz w:val="20"/>
-          <w:szCs w:val="24"/>
+          <w:szCs w:val="20"/>
           <w:lang w:val="en-US"/>
         </w:rPr>
       </w:pPr>
@@ -1477,60 +1568,62 @@
           <w:rFonts w:ascii="Noto Serif" w:eastAsia="Noto Serif SC" w:hAnsi="Noto Serif" w:cs="Noto Serif"/>
           <w:color w:val="000000" w:themeColor="text1"/>
           <w:sz w:val="20"/>
-          <w:szCs w:val="24"/>
-          <w:lang w:val="en-US"/>
-        </w:rPr>
-        <w:t>新加坡大会堂</w:t>
-      </w:r>
-    </w:p>
-    <w:p>
-      <w:pPr>
+          <w:szCs w:val="20"/>
+          <w:lang w:val="en-US"/>
+        </w:rPr>
+        <w:t>新加坡邮区</w:t>
+      </w:r>
+      <w:r>
         <w:rPr>
           <w:rFonts w:ascii="Noto Serif" w:eastAsia="Noto Serif SC" w:hAnsi="Noto Serif" w:cs="Noto Serif"/>
           <w:color w:val="000000" w:themeColor="text1"/>
           <w:sz w:val="20"/>
-          <w:szCs w:val="24"/>
-          <w:lang w:val="en-US"/>
-        </w:rPr>
-      </w:pPr>
-      <w:r>
+          <w:szCs w:val="20"/>
+          <w:lang w:val="en-US"/>
+        </w:rPr>
+        <w:t> 068810</w:t>
+      </w:r>
+    </w:p>
+    <w:p>
+      <w:pPr>
         <w:rPr>
           <w:rFonts w:ascii="Noto Serif" w:eastAsia="Noto Serif SC" w:hAnsi="Noto Serif" w:cs="Noto Serif"/>
           <w:color w:val="000000" w:themeColor="text1"/>
           <w:sz w:val="20"/>
-          <w:szCs w:val="24"/>
-          <w:lang w:val="en-US"/>
-        </w:rPr>
-        <w:t>新加坡邮区</w:t>
-      </w:r>
-      <w:r>
+          <w:szCs w:val="20"/>
+        </w:rPr>
+      </w:pPr>
+    </w:p>
+    <w:p>
+      <w:pPr>
+        <w:spacing w:line="276" w:lineRule="auto"/>
         <w:rPr>
           <w:rFonts w:ascii="Noto Serif" w:eastAsia="Noto Serif SC" w:hAnsi="Noto Serif" w:cs="Noto Serif"/>
           <w:color w:val="000000" w:themeColor="text1"/>
           <w:sz w:val="20"/>
-          <w:szCs w:val="24"/>
-          <w:lang w:val="en-US"/>
-        </w:rPr>
-        <w:t> 068810</w:t>
-      </w:r>
-    </w:p>
-    <w:p>
-      <w:pPr>
+          <w:szCs w:val="20"/>
+          <w:lang w:val="en-US"/>
+        </w:rPr>
+      </w:pPr>
+      <w:r>
         <w:rPr>
           <w:rFonts w:ascii="Noto Serif" w:eastAsia="Noto Serif SC" w:hAnsi="Noto Serif" w:cs="Noto Serif"/>
           <w:color w:val="000000" w:themeColor="text1"/>
           <w:sz w:val="20"/>
-          <w:szCs w:val="24"/>
-        </w:rPr>
-      </w:pPr>
-    </w:p>
-    <w:p>
-      <w:pPr>
+          <w:szCs w:val="20"/>
+          <w:lang w:val="en-US"/>
+        </w:rPr>
+        <w:t>Singapore Chinese Orchestra Co. Ltd.</w:t>
+      </w:r>
+    </w:p>
+    <w:p>
+      <w:pPr>
+        <w:spacing w:line="276" w:lineRule="auto"/>
         <w:rPr>
           <w:rFonts w:ascii="Noto Serif" w:eastAsia="Noto Serif SC" w:hAnsi="Noto Serif" w:cs="Noto Serif"/>
           <w:color w:val="000000" w:themeColor="text1"/>
           <w:sz w:val="20"/>
-          <w:szCs w:val="24"/>
+          <w:szCs w:val="20"/>
           <w:lang w:val="en-US"/>
         </w:rPr>
       </w:pPr>
@@ -1539,19 +1632,20 @@
           <w:rFonts w:ascii="Noto Serif" w:eastAsia="Noto Serif SC" w:hAnsi="Noto Serif" w:cs="Noto Serif"/>
           <w:color w:val="000000" w:themeColor="text1"/>
           <w:sz w:val="20"/>
-          <w:szCs w:val="24"/>
-          <w:lang w:val="en-US"/>
-        </w:rPr>
-        <w:t>Singapore Chinese Orchestra Co. Ltd.</w:t>
-      </w:r>
-    </w:p>
-    <w:p>
-      <w:pPr>
+          <w:szCs w:val="20"/>
+          <w:lang w:val="en-US"/>
+        </w:rPr>
+        <w:t>7 Shenton Way</w:t>
+      </w:r>
+    </w:p>
+    <w:p>
+      <w:pPr>
+        <w:spacing w:line="276" w:lineRule="auto"/>
         <w:rPr>
           <w:rFonts w:ascii="Noto Serif" w:eastAsia="Noto Serif SC" w:hAnsi="Noto Serif" w:cs="Noto Serif"/>
           <w:color w:val="000000" w:themeColor="text1"/>
           <w:sz w:val="20"/>
-          <w:szCs w:val="24"/>
+          <w:szCs w:val="20"/>
           <w:lang w:val="en-US"/>
         </w:rPr>
       </w:pPr>
@@ -1560,19 +1654,20 @@
           <w:rFonts w:ascii="Noto Serif" w:eastAsia="Noto Serif SC" w:hAnsi="Noto Serif" w:cs="Noto Serif"/>
           <w:color w:val="000000" w:themeColor="text1"/>
           <w:sz w:val="20"/>
-          <w:szCs w:val="24"/>
-          <w:lang w:val="en-US"/>
-        </w:rPr>
-        <w:t>7 Shenton Way</w:t>
-      </w:r>
-    </w:p>
-    <w:p>
-      <w:pPr>
+          <w:szCs w:val="20"/>
+          <w:lang w:val="en-US"/>
+        </w:rPr>
+        <w:t>Singapore Conference Hall</w:t>
+      </w:r>
+    </w:p>
+    <w:p>
+      <w:pPr>
+        <w:spacing w:line="276" w:lineRule="auto"/>
         <w:rPr>
           <w:rFonts w:ascii="Noto Serif" w:eastAsia="Noto Serif SC" w:hAnsi="Noto Serif" w:cs="Noto Serif"/>
           <w:color w:val="000000" w:themeColor="text1"/>
           <w:sz w:val="20"/>
-          <w:szCs w:val="24"/>
+          <w:szCs w:val="20"/>
           <w:lang w:val="en-US"/>
         </w:rPr>
       </w:pPr>
@@ -1581,28 +1676,7 @@
           <w:rFonts w:ascii="Noto Serif" w:eastAsia="Noto Serif SC" w:hAnsi="Noto Serif" w:cs="Noto Serif"/>
           <w:color w:val="000000" w:themeColor="text1"/>
           <w:sz w:val="20"/>
-          <w:szCs w:val="24"/>
-          <w:lang w:val="en-US"/>
-        </w:rPr>
-        <w:t>Singapore Conference Hall</w:t>
-      </w:r>
-    </w:p>
-    <w:p>
-      <w:pPr>
-        <w:rPr>
-          <w:rFonts w:ascii="Noto Serif" w:eastAsia="Noto Serif SC" w:hAnsi="Noto Serif" w:cs="Noto Serif"/>
-          <w:color w:val="000000" w:themeColor="text1"/>
-          <w:sz w:val="20"/>
-          <w:szCs w:val="24"/>
-          <w:lang w:val="en-US"/>
-        </w:rPr>
-      </w:pPr>
-      <w:r>
-        <w:rPr>
-          <w:rFonts w:ascii="Noto Serif" w:eastAsia="Noto Serif SC" w:hAnsi="Noto Serif" w:cs="Noto Serif"/>
-          <w:color w:val="000000" w:themeColor="text1"/>
-          <w:sz w:val="20"/>
-          <w:szCs w:val="24"/>
+          <w:szCs w:val="20"/>
           <w:lang w:val="en-US"/>
         </w:rPr>
         <w:t>Singapore 068810</w:t>
@@ -1646,7 +1720,7 @@
         </w:rPr>
         <w:t>Website: </w:t>
       </w:r>
-      <w:hyperlink r:id="rId10" w:tgtFrame="_blank" w:history="1">
+      <w:hyperlink r:id="rId11" w:tgtFrame="_blank" w:history="1">
         <w:r>
           <w:rPr>
             <w:rStyle w:val="Hyperlink"/>
@@ -1686,7 +1760,7 @@
         </w:rPr>
         <w:t>Email: </w:t>
       </w:r>
-      <w:hyperlink r:id="rId11" w:tgtFrame="_blank" w:history="1">
+      <w:hyperlink r:id="rId12" w:tgtFrame="_blank" w:history="1">
         <w:r>
           <w:rPr>
             <w:rStyle w:val="Hyperlink"/>
@@ -4418,62 +4492,6 @@
       <w:pStyle w:val="Footer"/>
       <w:jc w:val="center"/>
     </w:pPr>
-    <w:r>
-      <w:rPr>
-        <w:rFonts w:ascii="STKaiti" w:eastAsia="STKaiti" w:cs="STKaiti" w:hint="eastAsia"/>
-        <w:noProof/>
-        <w:sz w:val="144"/>
-        <w:szCs w:val="72"/>
-      </w:rPr>
-      <w:drawing>
-        <wp:inline distT="0" distB="0" distL="0" distR="0" wp14:anchorId="78C64FA9" wp14:editId="28637CE4">
-          <wp:extent cx="1947886" cy="2372348"/>
-          <wp:effectExtent l="0" t="0" r="0" b="3175"/>
-          <wp:docPr id="673708336" name="Picture 673708336"/>
-          <wp:cNvGraphicFramePr>
-            <a:graphicFrameLocks xmlns:a="http://schemas.openxmlformats.org/drawingml/2006/main" noChangeAspect="1"/>
-          </wp:cNvGraphicFramePr>
-          <a:graphic xmlns:a="http://schemas.openxmlformats.org/drawingml/2006/main">
-            <a:graphicData uri="http://schemas.openxmlformats.org/drawingml/2006/picture">
-              <pic:pic xmlns:pic="http://schemas.openxmlformats.org/drawingml/2006/picture">
-                <pic:nvPicPr>
-                  <pic:cNvPr id="0" name="Picture 1"/>
-                  <pic:cNvPicPr>
-                    <a:picLocks noChangeAspect="1" noChangeArrowheads="1"/>
-                  </pic:cNvPicPr>
-                </pic:nvPicPr>
-                <pic:blipFill>
-                  <a:blip r:embed="rId1">
-                    <a:extLst>
-                      <a:ext uri="{28A0092B-C50C-407E-A947-70E740481C1C}">
-                        <a14:useLocalDpi xmlns:a14="http://schemas.microsoft.com/office/drawing/2010/main" val="0"/>
-                      </a:ext>
-                    </a:extLst>
-                  </a:blip>
-                  <a:srcRect/>
-                  <a:stretch>
-                    <a:fillRect/>
-                  </a:stretch>
-                </pic:blipFill>
-                <pic:spPr bwMode="auto">
-                  <a:xfrm>
-                    <a:off x="0" y="0"/>
-                    <a:ext cx="1986581" cy="2419475"/>
-                  </a:xfrm>
-                  <a:prstGeom prst="rect">
-                    <a:avLst/>
-                  </a:prstGeom>
-                  <a:noFill/>
-                  <a:ln>
-                    <a:noFill/>
-                  </a:ln>
-                </pic:spPr>
-              </pic:pic>
-            </a:graphicData>
-          </a:graphic>
-        </wp:inline>
-      </w:drawing>
-    </w:r>
   </w:p>
 </w:ftr>
 </file>
@@ -5047,6 +5065,7 @@
   <w:style w:type="character" w:default="1" w:styleId="DefaultParagraphFont">
     <w:name w:val="Default Paragraph Font"/>
     <w:uiPriority w:val="1"/>
+    <w:semiHidden/>
     <w:unhideWhenUsed/>
   </w:style>
   <w:style w:type="table" w:default="1" w:styleId="TableNormal">

</xml_diff>